<commit_message>
Statuto 1.1: clausola arbitrale mantenuta (art. 33.3)
Co-Authored-By: Claude Opus 5.5 <noreply@anthropic.com>
Claude-Session: https://claude.ai/code/session_01Sfc7e99uvPwL46pV3DVmkv
</commit_message>
<xml_diff>
--- a/docs/statuto/BAS-statuto-v.1.1.docx
+++ b/docs/statuto/BAS-statuto-v.1.1.docx
@@ -4700,6 +4700,33 @@
           <w:szCs w:val="22"/>
         </w:rPr>
         <w:t xml:space="preserve">Le controversie disciplinari interne sono decise dagli organi dell'Associazione secondo gli artt. 9 e 10; i provvedimenti adottati a tutela dell'incolumità delle persone sono immediatamente esecutivi.</w:t>
+      </w:r>
+    </w:p>
+    <w:p>
+      <w:pPr>
+        <w:pStyle w:val="NormaleWeb"/>
+        <w:widowControl w:val="0"/>
+        <w:numPr>
+          <w:ilvl w:val="0"/>
+          <w:numId w:val="133"/>
+        </w:numPr>
+        <w:spacing w:before="0" w:beforeAutospacing="0" w:after="40" w:afterAutospacing="0"/>
+        <w:ind w:left="714" w:hanging="357"/>
+        <w:jc w:val="both"/>
+        <w:rPr>
+          <w:rFonts w:asciiTheme="majorHAnsi" w:hAnsiTheme="majorHAnsi" w:cstheme="majorHAnsi"/>
+          <w:sz w:val="22"/>
+          <w:szCs w:val="22"/>
+        </w:rPr>
+      </w:pPr>
+      <w:r>
+        <w:rPr>
+          <w:rFonts w:asciiTheme="majorHAnsi" w:hAnsiTheme="majorHAnsi" w:cstheme="majorHAnsi"/>
+          <w:color w:val="111111"/>
+          <w:sz w:val="22"/>
+          <w:szCs w:val="22"/>
+        </w:rPr>
+        <w:t xml:space="preserve">Ogni altra controversia tra i soci, o tra i soci e l'Associazione o i suoi organi, relativa al rapporto associativo e compromettibile per legge, è devoluta a un collegio di tre arbitri. Ciascuna parte nomina un arbitro; il terzo, con funzioni di presidente, è nominato di comune accordo dai primi due o, in mancanza di accordo, dal Presidente del Tribunale di Terni su istanza della parte più diligente. Il collegio decide secondo diritto, con arbitrato rituale.</w:t>
       </w:r>
     </w:p>
     <w:p>
@@ -8134,7 +8161,7 @@
     </w:lvl>
   </w:abstractNum>
   <w:abstractNum w:abstractNumId="101" w15:restartNumberingAfterBreak="0">
-    <w:nsid w:val="CB88A498"/>
+    <w:nsid w:val="CCDBFE55"/>
     <w:multiLevelType w:val="hybridMultilevel"/>
     <w:tmpl w:val="357434FC"/>
     <w:lvl w:ilvl="0" w:tplc="A022C79E">
@@ -8224,7 +8251,7 @@
     </w:lvl>
   </w:abstractNum>
   <w:abstractNum w:abstractNumId="102" w15:restartNumberingAfterBreak="0">
-    <w:nsid w:val="F978BF2C"/>
+    <w:nsid w:val="8397B3D0"/>
     <w:multiLevelType w:val="hybridMultilevel"/>
     <w:tmpl w:val="357434FC"/>
     <w:lvl w:ilvl="0" w:tplc="A022C79E">
@@ -8314,7 +8341,7 @@
     </w:lvl>
   </w:abstractNum>
   <w:abstractNum w:abstractNumId="103" w15:restartNumberingAfterBreak="0">
-    <w:nsid w:val="32DDC707"/>
+    <w:nsid w:val="30D48D32"/>
     <w:multiLevelType w:val="hybridMultilevel"/>
     <w:tmpl w:val="357434FC"/>
     <w:lvl w:ilvl="0" w:tplc="A022C79E">
@@ -8404,7 +8431,7 @@
     </w:lvl>
   </w:abstractNum>
   <w:abstractNum w:abstractNumId="104" w15:restartNumberingAfterBreak="0">
-    <w:nsid w:val="CD0FD7AB"/>
+    <w:nsid w:val="E42FED75"/>
     <w:multiLevelType w:val="hybridMultilevel"/>
     <w:tmpl w:val="357434FC"/>
     <w:lvl w:ilvl="0" w:tplc="A022C79E">
@@ -8494,7 +8521,7 @@
     </w:lvl>
   </w:abstractNum>
   <w:abstractNum w:abstractNumId="105" w15:restartNumberingAfterBreak="0">
-    <w:nsid w:val="C3B3EEBD"/>
+    <w:nsid w:val="2DF3CBF3"/>
     <w:multiLevelType w:val="hybridMultilevel"/>
     <w:tmpl w:val="357434FC"/>
     <w:lvl w:ilvl="0" w:tplc="A022C79E">
@@ -8584,7 +8611,7 @@
     </w:lvl>
   </w:abstractNum>
   <w:abstractNum w:abstractNumId="106" w15:restartNumberingAfterBreak="0">
-    <w:nsid w:val="105BFDA6"/>
+    <w:nsid w:val="C0ED1E17"/>
     <w:multiLevelType w:val="hybridMultilevel"/>
     <w:tmpl w:val="357434FC"/>
     <w:lvl w:ilvl="0" w:tplc="A022C79E">
@@ -8674,7 +8701,7 @@
     </w:lvl>
   </w:abstractNum>
   <w:abstractNum w:abstractNumId="107" w15:restartNumberingAfterBreak="0">
-    <w:nsid w:val="8D66B92C"/>
+    <w:nsid w:val="CD6696D3"/>
     <w:multiLevelType w:val="hybridMultilevel"/>
     <w:tmpl w:val="357434FC"/>
     <w:lvl w:ilvl="0" w:tplc="A022C79E">
@@ -8764,7 +8791,7 @@
     </w:lvl>
   </w:abstractNum>
   <w:abstractNum w:abstractNumId="108" w15:restartNumberingAfterBreak="0">
-    <w:nsid w:val="660C43B7"/>
+    <w:nsid w:val="51DF08C2"/>
     <w:multiLevelType w:val="hybridMultilevel"/>
     <w:tmpl w:val="357434FC"/>
     <w:lvl w:ilvl="0" w:tplc="A022C79E">
@@ -8854,7 +8881,7 @@
     </w:lvl>
   </w:abstractNum>
   <w:abstractNum w:abstractNumId="109" w15:restartNumberingAfterBreak="0">
-    <w:nsid w:val="723810C2"/>
+    <w:nsid w:val="5CC377FB"/>
     <w:multiLevelType w:val="hybridMultilevel"/>
     <w:tmpl w:val="357434FC"/>
     <w:lvl w:ilvl="0" w:tplc="A022C79E">
@@ -8944,7 +8971,7 @@
     </w:lvl>
   </w:abstractNum>
   <w:abstractNum w:abstractNumId="110" w15:restartNumberingAfterBreak="0">
-    <w:nsid w:val="3E40F4C9"/>
+    <w:nsid w:val="4099957D"/>
     <w:multiLevelType w:val="hybridMultilevel"/>
     <w:tmpl w:val="357434FC"/>
     <w:lvl w:ilvl="0" w:tplc="A022C79E">
@@ -9034,7 +9061,7 @@
     </w:lvl>
   </w:abstractNum>
   <w:abstractNum w:abstractNumId="111" w15:restartNumberingAfterBreak="0">
-    <w:nsid w:val="AF42E6EA"/>
+    <w:nsid w:val="7CA50213"/>
     <w:multiLevelType w:val="hybridMultilevel"/>
     <w:tmpl w:val="357434FC"/>
     <w:lvl w:ilvl="0" w:tplc="A022C79E">
@@ -9124,7 +9151,7 @@
     </w:lvl>
   </w:abstractNum>
   <w:abstractNum w:abstractNumId="112" w15:restartNumberingAfterBreak="0">
-    <w:nsid w:val="D46690DE"/>
+    <w:nsid w:val="925DE164"/>
     <w:multiLevelType w:val="hybridMultilevel"/>
     <w:tmpl w:val="357434FC"/>
     <w:lvl w:ilvl="0" w:tplc="A022C79E">
@@ -9214,7 +9241,7 @@
     </w:lvl>
   </w:abstractNum>
   <w:abstractNum w:abstractNumId="113" w15:restartNumberingAfterBreak="0">
-    <w:nsid w:val="502402DB"/>
+    <w:nsid w:val="58D592E4"/>
     <w:multiLevelType w:val="hybridMultilevel"/>
     <w:tmpl w:val="357434FC"/>
     <w:lvl w:ilvl="0" w:tplc="A022C79E">
@@ -9304,7 +9331,7 @@
     </w:lvl>
   </w:abstractNum>
   <w:abstractNum w:abstractNumId="114" w15:restartNumberingAfterBreak="0">
-    <w:nsid w:val="B7B7333E"/>
+    <w:nsid w:val="B3F12B44"/>
     <w:multiLevelType w:val="hybridMultilevel"/>
     <w:tmpl w:val="357434FC"/>
     <w:lvl w:ilvl="0" w:tplc="A022C79E">
@@ -9394,7 +9421,7 @@
     </w:lvl>
   </w:abstractNum>
   <w:abstractNum w:abstractNumId="115" w15:restartNumberingAfterBreak="0">
-    <w:nsid w:val="2D4A729D"/>
+    <w:nsid w:val="3149BD75"/>
     <w:multiLevelType w:val="hybridMultilevel"/>
     <w:tmpl w:val="357434FC"/>
     <w:lvl w:ilvl="0" w:tplc="A022C79E">
@@ -9484,7 +9511,7 @@
     </w:lvl>
   </w:abstractNum>
   <w:abstractNum w:abstractNumId="116" w15:restartNumberingAfterBreak="0">
-    <w:nsid w:val="5384B50D"/>
+    <w:nsid w:val="F71898C7"/>
     <w:multiLevelType w:val="hybridMultilevel"/>
     <w:tmpl w:val="357434FC"/>
     <w:lvl w:ilvl="0" w:tplc="A022C79E">
@@ -9574,7 +9601,7 @@
     </w:lvl>
   </w:abstractNum>
   <w:abstractNum w:abstractNumId="117" w15:restartNumberingAfterBreak="0">
-    <w:nsid w:val="F2063E5F"/>
+    <w:nsid w:val="D81FF5E6"/>
     <w:multiLevelType w:val="hybridMultilevel"/>
     <w:tmpl w:val="357434FC"/>
     <w:lvl w:ilvl="0" w:tplc="A022C79E">
@@ -9664,7 +9691,7 @@
     </w:lvl>
   </w:abstractNum>
   <w:abstractNum w:abstractNumId="118" w15:restartNumberingAfterBreak="0">
-    <w:nsid w:val="775B338C"/>
+    <w:nsid w:val="864BB3E6"/>
     <w:multiLevelType w:val="hybridMultilevel"/>
     <w:tmpl w:val="357434FC"/>
     <w:lvl w:ilvl="0" w:tplc="A022C79E">
@@ -9754,7 +9781,7 @@
     </w:lvl>
   </w:abstractNum>
   <w:abstractNum w:abstractNumId="119" w15:restartNumberingAfterBreak="0">
-    <w:nsid w:val="C62412E3"/>
+    <w:nsid w:val="B09D2E10"/>
     <w:multiLevelType w:val="hybridMultilevel"/>
     <w:tmpl w:val="357434FC"/>
     <w:lvl w:ilvl="0" w:tplc="A022C79E">
@@ -9844,7 +9871,7 @@
     </w:lvl>
   </w:abstractNum>
   <w:abstractNum w:abstractNumId="120" w15:restartNumberingAfterBreak="0">
-    <w:nsid w:val="B2D0BE68"/>
+    <w:nsid w:val="4A6C16DF"/>
     <w:multiLevelType w:val="hybridMultilevel"/>
     <w:tmpl w:val="357434FC"/>
     <w:lvl w:ilvl="0" w:tplc="A022C79E">
@@ -9934,7 +9961,7 @@
     </w:lvl>
   </w:abstractNum>
   <w:abstractNum w:abstractNumId="121" w15:restartNumberingAfterBreak="0">
-    <w:nsid w:val="7855B07C"/>
+    <w:nsid w:val="AE0FBF0B"/>
     <w:multiLevelType w:val="hybridMultilevel"/>
     <w:tmpl w:val="357434FC"/>
     <w:lvl w:ilvl="0" w:tplc="A022C79E">
@@ -10024,7 +10051,7 @@
     </w:lvl>
   </w:abstractNum>
   <w:abstractNum w:abstractNumId="122" w15:restartNumberingAfterBreak="0">
-    <w:nsid w:val="95E85E7C"/>
+    <w:nsid w:val="F9F28CF9"/>
     <w:multiLevelType w:val="hybridMultilevel"/>
     <w:tmpl w:val="357434FC"/>
     <w:lvl w:ilvl="0" w:tplc="A022C79E">
@@ -10114,7 +10141,7 @@
     </w:lvl>
   </w:abstractNum>
   <w:abstractNum w:abstractNumId="123" w15:restartNumberingAfterBreak="0">
-    <w:nsid w:val="D3764BD6"/>
+    <w:nsid w:val="7373B546"/>
     <w:multiLevelType w:val="hybridMultilevel"/>
     <w:tmpl w:val="357434FC"/>
     <w:lvl w:ilvl="0" w:tplc="A022C79E">
@@ -10204,7 +10231,7 @@
     </w:lvl>
   </w:abstractNum>
   <w:abstractNum w:abstractNumId="124" w15:restartNumberingAfterBreak="0">
-    <w:nsid w:val="F77AFE70"/>
+    <w:nsid w:val="994385E9"/>
     <w:multiLevelType w:val="hybridMultilevel"/>
     <w:tmpl w:val="357434FC"/>
     <w:lvl w:ilvl="0" w:tplc="A022C79E">
@@ -10294,7 +10321,7 @@
     </w:lvl>
   </w:abstractNum>
   <w:abstractNum w:abstractNumId="125" w15:restartNumberingAfterBreak="0">
-    <w:nsid w:val="B4F100EA"/>
+    <w:nsid w:val="7C107D90"/>
     <w:multiLevelType w:val="hybridMultilevel"/>
     <w:tmpl w:val="357434FC"/>
     <w:lvl w:ilvl="0" w:tplc="A022C79E">
@@ -10384,7 +10411,7 @@
     </w:lvl>
   </w:abstractNum>
   <w:abstractNum w:abstractNumId="126" w15:restartNumberingAfterBreak="0">
-    <w:nsid w:val="7C17DCAF"/>
+    <w:nsid w:val="44673466"/>
     <w:multiLevelType w:val="hybridMultilevel"/>
     <w:tmpl w:val="357434FC"/>
     <w:lvl w:ilvl="0" w:tplc="A022C79E">
@@ -10474,7 +10501,7 @@
     </w:lvl>
   </w:abstractNum>
   <w:abstractNum w:abstractNumId="127" w15:restartNumberingAfterBreak="0">
-    <w:nsid w:val="97BC9A74"/>
+    <w:nsid w:val="F5445D39"/>
     <w:multiLevelType w:val="hybridMultilevel"/>
     <w:tmpl w:val="357434FC"/>
     <w:lvl w:ilvl="0" w:tplc="A022C79E">
@@ -10564,7 +10591,7 @@
     </w:lvl>
   </w:abstractNum>
   <w:abstractNum w:abstractNumId="128" w15:restartNumberingAfterBreak="0">
-    <w:nsid w:val="2607F130"/>
+    <w:nsid w:val="5787043B"/>
     <w:multiLevelType w:val="hybridMultilevel"/>
     <w:tmpl w:val="357434FC"/>
     <w:lvl w:ilvl="0" w:tplc="A022C79E">
@@ -10654,7 +10681,7 @@
     </w:lvl>
   </w:abstractNum>
   <w:abstractNum w:abstractNumId="129" w15:restartNumberingAfterBreak="0">
-    <w:nsid w:val="172DB5E2"/>
+    <w:nsid w:val="8445C3B1"/>
     <w:multiLevelType w:val="hybridMultilevel"/>
     <w:tmpl w:val="357434FC"/>
     <w:lvl w:ilvl="0" w:tplc="A022C79E">
@@ -10744,7 +10771,7 @@
     </w:lvl>
   </w:abstractNum>
   <w:abstractNum w:abstractNumId="130" w15:restartNumberingAfterBreak="0">
-    <w:nsid w:val="B842F559"/>
+    <w:nsid w:val="49504E51"/>
     <w:multiLevelType w:val="hybridMultilevel"/>
     <w:tmpl w:val="357434FC"/>
     <w:lvl w:ilvl="0" w:tplc="A022C79E">
@@ -10834,7 +10861,7 @@
     </w:lvl>
   </w:abstractNum>
   <w:abstractNum w:abstractNumId="131" w15:restartNumberingAfterBreak="0">
-    <w:nsid w:val="73C6E8A1"/>
+    <w:nsid w:val="B88F7E16"/>
     <w:multiLevelType w:val="hybridMultilevel"/>
     <w:tmpl w:val="357434FC"/>
     <w:lvl w:ilvl="0" w:tplc="A022C79E">
@@ -10924,7 +10951,7 @@
     </w:lvl>
   </w:abstractNum>
   <w:abstractNum w:abstractNumId="132" w15:restartNumberingAfterBreak="0">
-    <w:nsid w:val="B80FDE27"/>
+    <w:nsid w:val="E591F0C8"/>
     <w:multiLevelType w:val="hybridMultilevel"/>
     <w:tmpl w:val="357434FC"/>
     <w:lvl w:ilvl="0" w:tplc="A022C79E">
@@ -11014,7 +11041,7 @@
     </w:lvl>
   </w:abstractNum>
   <w:abstractNum w:abstractNumId="133" w15:restartNumberingAfterBreak="0">
-    <w:nsid w:val="36FE1484"/>
+    <w:nsid w:val="88C623C5"/>
     <w:multiLevelType w:val="hybridMultilevel"/>
     <w:tmpl w:val="357434FC"/>
     <w:lvl w:ilvl="0" w:tplc="A022C79E">
@@ -11104,7 +11131,7 @@
     </w:lvl>
   </w:abstractNum>
   <w:abstractNum w:abstractNumId="134" w15:restartNumberingAfterBreak="0">
-    <w:nsid w:val="53787962"/>
+    <w:nsid w:val="FA46A64E"/>
     <w:multiLevelType w:val="hybridMultilevel"/>
     <w:tmpl w:val="357434FC"/>
     <w:lvl w:ilvl="0" w:tplc="A022C79E">

</xml_diff>

<commit_message>
Statuto 1.1: volontari assicurati, responsabile della tutela esterno al CD, tolta la norma transitoria sulle quote
Co-Authored-By: Claude Opus 5.5 <noreply@anthropic.com>
Claude-Session: https://claude.ai/code/session_01Sfc7e99uvPwL46pV3DVmkv
</commit_message>
<xml_diff>
--- a/docs/statuto/BAS-statuto-v.1.1.docx
+++ b/docs/statuto/BAS-statuto-v.1.1.docx
@@ -4177,7 +4177,7 @@
           <w:sz w:val="22"/>
           <w:szCs w:val="22"/>
         </w:rPr>
-        <w:t xml:space="preserve">L'attività di volontario è incompatibile con qualsiasi rapporto di lavoro retribuito con l'Associazione. L'Associazione assicura i volontari per la responsabilità civile verso terzi, come previsto dalla legge.</w:t>
+        <w:t xml:space="preserve">L'attività di volontario è incompatibile con qualsiasi rapporto di lavoro retribuito con l'Associazione. L'Associazione assicura i volontari per la responsabilità civile verso terzi, come previsto dalla legge, anche mediante polizze collettive o le coperture assicurative del tesseramento.</w:t>
       </w:r>
     </w:p>
     <w:p>
@@ -4546,7 +4546,7 @@
           <w:sz w:val="22"/>
           <w:szCs w:val="22"/>
         </w:rPr>
-        <w:t xml:space="preserve">Il Consiglio Direttivo nomina un responsabile per la protezione dei tesserati da abusi, violenze e discriminazioni, e ne rende noti il nominativo e i recapiti.</w:t>
+        <w:t xml:space="preserve">Il Consiglio Direttivo nomina un responsabile per la protezione dei tesserati da abusi, violenze e discriminazioni, scelto al di fuori del Consiglio Direttivo per garantirne l'autonomia e l'assenza di conflitti di interesse, anche tra persone non socie, e ne rende noti il nominativo e i recapiti.</w:t>
       </w:r>
     </w:p>
     <w:p>
@@ -4817,33 +4817,6 @@
           <w:szCs w:val="22"/>
         </w:rPr>
         <w:t xml:space="preserve">Il Consiglio Direttivo eletto con l'atto costitutivo del 24 luglio 2024 resta in carica, con le cariche attribuite alla data di adozione del presente statuto, per quattro anni dalla nomina, come previsto dallo statuto approvato con l'atto costitutivo; l'indicazione "per il primo anno" contenuta nell'atto costitutivo è superata. Alla scadenza, l'Assemblea elegge il nuovo Consiglio Direttivo secondo il presente statuto.</w:t>
-      </w:r>
-    </w:p>
-    <w:p>
-      <w:pPr>
-        <w:pStyle w:val="NormaleWeb"/>
-        <w:widowControl w:val="0"/>
-        <w:numPr>
-          <w:ilvl w:val="0"/>
-          <w:numId w:val="134"/>
-        </w:numPr>
-        <w:spacing w:before="0" w:beforeAutospacing="0" w:after="40" w:afterAutospacing="0"/>
-        <w:ind w:left="714" w:hanging="357"/>
-        <w:jc w:val="both"/>
-        <w:rPr>
-          <w:rFonts w:asciiTheme="majorHAnsi" w:hAnsiTheme="majorHAnsi" w:cstheme="majorHAnsi"/>
-          <w:sz w:val="22"/>
-          <w:szCs w:val="22"/>
-        </w:rPr>
-      </w:pPr>
-      <w:r>
-        <w:rPr>
-          <w:rFonts w:asciiTheme="majorHAnsi" w:hAnsiTheme="majorHAnsi" w:cstheme="majorHAnsi"/>
-          <w:color w:val="111111"/>
-          <w:sz w:val="22"/>
-          <w:szCs w:val="22"/>
-        </w:rPr>
-        <w:t xml:space="preserve">Le iscrizioni in corso alla data di adozione restano valide fino al 31 dicembre 2026. Dal 1° gennaio 2027 la quota associativa è annuale, con il termine dell'art. 8.</w:t>
       </w:r>
     </w:p>
     <w:p>
@@ -8161,7 +8134,7 @@
     </w:lvl>
   </w:abstractNum>
   <w:abstractNum w:abstractNumId="101" w15:restartNumberingAfterBreak="0">
-    <w:nsid w:val="CCDBFE55"/>
+    <w:nsid w:val="8D7729B4"/>
     <w:multiLevelType w:val="hybridMultilevel"/>
     <w:tmpl w:val="357434FC"/>
     <w:lvl w:ilvl="0" w:tplc="A022C79E">
@@ -8251,7 +8224,7 @@
     </w:lvl>
   </w:abstractNum>
   <w:abstractNum w:abstractNumId="102" w15:restartNumberingAfterBreak="0">
-    <w:nsid w:val="8397B3D0"/>
+    <w:nsid w:val="A74737B4"/>
     <w:multiLevelType w:val="hybridMultilevel"/>
     <w:tmpl w:val="357434FC"/>
     <w:lvl w:ilvl="0" w:tplc="A022C79E">
@@ -8341,7 +8314,7 @@
     </w:lvl>
   </w:abstractNum>
   <w:abstractNum w:abstractNumId="103" w15:restartNumberingAfterBreak="0">
-    <w:nsid w:val="30D48D32"/>
+    <w:nsid w:val="F564F3A3"/>
     <w:multiLevelType w:val="hybridMultilevel"/>
     <w:tmpl w:val="357434FC"/>
     <w:lvl w:ilvl="0" w:tplc="A022C79E">
@@ -8431,7 +8404,7 @@
     </w:lvl>
   </w:abstractNum>
   <w:abstractNum w:abstractNumId="104" w15:restartNumberingAfterBreak="0">
-    <w:nsid w:val="E42FED75"/>
+    <w:nsid w:val="6F1442F5"/>
     <w:multiLevelType w:val="hybridMultilevel"/>
     <w:tmpl w:val="357434FC"/>
     <w:lvl w:ilvl="0" w:tplc="A022C79E">
@@ -8521,7 +8494,7 @@
     </w:lvl>
   </w:abstractNum>
   <w:abstractNum w:abstractNumId="105" w15:restartNumberingAfterBreak="0">
-    <w:nsid w:val="2DF3CBF3"/>
+    <w:nsid w:val="7E7FF27E"/>
     <w:multiLevelType w:val="hybridMultilevel"/>
     <w:tmpl w:val="357434FC"/>
     <w:lvl w:ilvl="0" w:tplc="A022C79E">
@@ -8611,7 +8584,7 @@
     </w:lvl>
   </w:abstractNum>
   <w:abstractNum w:abstractNumId="106" w15:restartNumberingAfterBreak="0">
-    <w:nsid w:val="C0ED1E17"/>
+    <w:nsid w:val="53DF8D44"/>
     <w:multiLevelType w:val="hybridMultilevel"/>
     <w:tmpl w:val="357434FC"/>
     <w:lvl w:ilvl="0" w:tplc="A022C79E">
@@ -8701,7 +8674,7 @@
     </w:lvl>
   </w:abstractNum>
   <w:abstractNum w:abstractNumId="107" w15:restartNumberingAfterBreak="0">
-    <w:nsid w:val="CD6696D3"/>
+    <w:nsid w:val="1388B991"/>
     <w:multiLevelType w:val="hybridMultilevel"/>
     <w:tmpl w:val="357434FC"/>
     <w:lvl w:ilvl="0" w:tplc="A022C79E">
@@ -8791,7 +8764,7 @@
     </w:lvl>
   </w:abstractNum>
   <w:abstractNum w:abstractNumId="108" w15:restartNumberingAfterBreak="0">
-    <w:nsid w:val="51DF08C2"/>
+    <w:nsid w:val="AB43FAA3"/>
     <w:multiLevelType w:val="hybridMultilevel"/>
     <w:tmpl w:val="357434FC"/>
     <w:lvl w:ilvl="0" w:tplc="A022C79E">
@@ -8881,7 +8854,7 @@
     </w:lvl>
   </w:abstractNum>
   <w:abstractNum w:abstractNumId="109" w15:restartNumberingAfterBreak="0">
-    <w:nsid w:val="5CC377FB"/>
+    <w:nsid w:val="38F67501"/>
     <w:multiLevelType w:val="hybridMultilevel"/>
     <w:tmpl w:val="357434FC"/>
     <w:lvl w:ilvl="0" w:tplc="A022C79E">
@@ -8971,7 +8944,7 @@
     </w:lvl>
   </w:abstractNum>
   <w:abstractNum w:abstractNumId="110" w15:restartNumberingAfterBreak="0">
-    <w:nsid w:val="4099957D"/>
+    <w:nsid w:val="86ABF9D4"/>
     <w:multiLevelType w:val="hybridMultilevel"/>
     <w:tmpl w:val="357434FC"/>
     <w:lvl w:ilvl="0" w:tplc="A022C79E">
@@ -9061,7 +9034,7 @@
     </w:lvl>
   </w:abstractNum>
   <w:abstractNum w:abstractNumId="111" w15:restartNumberingAfterBreak="0">
-    <w:nsid w:val="7CA50213"/>
+    <w:nsid w:val="D93385FB"/>
     <w:multiLevelType w:val="hybridMultilevel"/>
     <w:tmpl w:val="357434FC"/>
     <w:lvl w:ilvl="0" w:tplc="A022C79E">
@@ -9151,7 +9124,7 @@
     </w:lvl>
   </w:abstractNum>
   <w:abstractNum w:abstractNumId="112" w15:restartNumberingAfterBreak="0">
-    <w:nsid w:val="925DE164"/>
+    <w:nsid w:val="E65FD8A4"/>
     <w:multiLevelType w:val="hybridMultilevel"/>
     <w:tmpl w:val="357434FC"/>
     <w:lvl w:ilvl="0" w:tplc="A022C79E">
@@ -9241,7 +9214,7 @@
     </w:lvl>
   </w:abstractNum>
   <w:abstractNum w:abstractNumId="113" w15:restartNumberingAfterBreak="0">
-    <w:nsid w:val="58D592E4"/>
+    <w:nsid w:val="5E962D2E"/>
     <w:multiLevelType w:val="hybridMultilevel"/>
     <w:tmpl w:val="357434FC"/>
     <w:lvl w:ilvl="0" w:tplc="A022C79E">
@@ -9331,7 +9304,7 @@
     </w:lvl>
   </w:abstractNum>
   <w:abstractNum w:abstractNumId="114" w15:restartNumberingAfterBreak="0">
-    <w:nsid w:val="B3F12B44"/>
+    <w:nsid w:val="D8D2D8B0"/>
     <w:multiLevelType w:val="hybridMultilevel"/>
     <w:tmpl w:val="357434FC"/>
     <w:lvl w:ilvl="0" w:tplc="A022C79E">
@@ -9421,7 +9394,7 @@
     </w:lvl>
   </w:abstractNum>
   <w:abstractNum w:abstractNumId="115" w15:restartNumberingAfterBreak="0">
-    <w:nsid w:val="3149BD75"/>
+    <w:nsid w:val="D54A1D6C"/>
     <w:multiLevelType w:val="hybridMultilevel"/>
     <w:tmpl w:val="357434FC"/>
     <w:lvl w:ilvl="0" w:tplc="A022C79E">
@@ -9511,7 +9484,7 @@
     </w:lvl>
   </w:abstractNum>
   <w:abstractNum w:abstractNumId="116" w15:restartNumberingAfterBreak="0">
-    <w:nsid w:val="F71898C7"/>
+    <w:nsid w:val="6E034D3D"/>
     <w:multiLevelType w:val="hybridMultilevel"/>
     <w:tmpl w:val="357434FC"/>
     <w:lvl w:ilvl="0" w:tplc="A022C79E">
@@ -9601,7 +9574,7 @@
     </w:lvl>
   </w:abstractNum>
   <w:abstractNum w:abstractNumId="117" w15:restartNumberingAfterBreak="0">
-    <w:nsid w:val="D81FF5E6"/>
+    <w:nsid w:val="2638E749"/>
     <w:multiLevelType w:val="hybridMultilevel"/>
     <w:tmpl w:val="357434FC"/>
     <w:lvl w:ilvl="0" w:tplc="A022C79E">
@@ -9691,7 +9664,7 @@
     </w:lvl>
   </w:abstractNum>
   <w:abstractNum w:abstractNumId="118" w15:restartNumberingAfterBreak="0">
-    <w:nsid w:val="864BB3E6"/>
+    <w:nsid w:val="5BD17662"/>
     <w:multiLevelType w:val="hybridMultilevel"/>
     <w:tmpl w:val="357434FC"/>
     <w:lvl w:ilvl="0" w:tplc="A022C79E">
@@ -9781,7 +9754,7 @@
     </w:lvl>
   </w:abstractNum>
   <w:abstractNum w:abstractNumId="119" w15:restartNumberingAfterBreak="0">
-    <w:nsid w:val="B09D2E10"/>
+    <w:nsid w:val="AAB3CB0A"/>
     <w:multiLevelType w:val="hybridMultilevel"/>
     <w:tmpl w:val="357434FC"/>
     <w:lvl w:ilvl="0" w:tplc="A022C79E">
@@ -9871,7 +9844,7 @@
     </w:lvl>
   </w:abstractNum>
   <w:abstractNum w:abstractNumId="120" w15:restartNumberingAfterBreak="0">
-    <w:nsid w:val="4A6C16DF"/>
+    <w:nsid w:val="BE0141BA"/>
     <w:multiLevelType w:val="hybridMultilevel"/>
     <w:tmpl w:val="357434FC"/>
     <w:lvl w:ilvl="0" w:tplc="A022C79E">
@@ -9961,7 +9934,7 @@
     </w:lvl>
   </w:abstractNum>
   <w:abstractNum w:abstractNumId="121" w15:restartNumberingAfterBreak="0">
-    <w:nsid w:val="AE0FBF0B"/>
+    <w:nsid w:val="61FF44AA"/>
     <w:multiLevelType w:val="hybridMultilevel"/>
     <w:tmpl w:val="357434FC"/>
     <w:lvl w:ilvl="0" w:tplc="A022C79E">
@@ -10051,7 +10024,7 @@
     </w:lvl>
   </w:abstractNum>
   <w:abstractNum w:abstractNumId="122" w15:restartNumberingAfterBreak="0">
-    <w:nsid w:val="F9F28CF9"/>
+    <w:nsid w:val="8A9915BD"/>
     <w:multiLevelType w:val="hybridMultilevel"/>
     <w:tmpl w:val="357434FC"/>
     <w:lvl w:ilvl="0" w:tplc="A022C79E">
@@ -10141,7 +10114,7 @@
     </w:lvl>
   </w:abstractNum>
   <w:abstractNum w:abstractNumId="123" w15:restartNumberingAfterBreak="0">
-    <w:nsid w:val="7373B546"/>
+    <w:nsid w:val="2D80D227"/>
     <w:multiLevelType w:val="hybridMultilevel"/>
     <w:tmpl w:val="357434FC"/>
     <w:lvl w:ilvl="0" w:tplc="A022C79E">
@@ -10231,7 +10204,7 @@
     </w:lvl>
   </w:abstractNum>
   <w:abstractNum w:abstractNumId="124" w15:restartNumberingAfterBreak="0">
-    <w:nsid w:val="994385E9"/>
+    <w:nsid w:val="A1981754"/>
     <w:multiLevelType w:val="hybridMultilevel"/>
     <w:tmpl w:val="357434FC"/>
     <w:lvl w:ilvl="0" w:tplc="A022C79E">
@@ -10321,7 +10294,7 @@
     </w:lvl>
   </w:abstractNum>
   <w:abstractNum w:abstractNumId="125" w15:restartNumberingAfterBreak="0">
-    <w:nsid w:val="7C107D90"/>
+    <w:nsid w:val="DB341BCA"/>
     <w:multiLevelType w:val="hybridMultilevel"/>
     <w:tmpl w:val="357434FC"/>
     <w:lvl w:ilvl="0" w:tplc="A022C79E">
@@ -10411,7 +10384,7 @@
     </w:lvl>
   </w:abstractNum>
   <w:abstractNum w:abstractNumId="126" w15:restartNumberingAfterBreak="0">
-    <w:nsid w:val="44673466"/>
+    <w:nsid w:val="221C657D"/>
     <w:multiLevelType w:val="hybridMultilevel"/>
     <w:tmpl w:val="357434FC"/>
     <w:lvl w:ilvl="0" w:tplc="A022C79E">
@@ -10501,7 +10474,7 @@
     </w:lvl>
   </w:abstractNum>
   <w:abstractNum w:abstractNumId="127" w15:restartNumberingAfterBreak="0">
-    <w:nsid w:val="F5445D39"/>
+    <w:nsid w:val="B22D2D52"/>
     <w:multiLevelType w:val="hybridMultilevel"/>
     <w:tmpl w:val="357434FC"/>
     <w:lvl w:ilvl="0" w:tplc="A022C79E">
@@ -10591,7 +10564,7 @@
     </w:lvl>
   </w:abstractNum>
   <w:abstractNum w:abstractNumId="128" w15:restartNumberingAfterBreak="0">
-    <w:nsid w:val="5787043B"/>
+    <w:nsid w:val="292A1408"/>
     <w:multiLevelType w:val="hybridMultilevel"/>
     <w:tmpl w:val="357434FC"/>
     <w:lvl w:ilvl="0" w:tplc="A022C79E">
@@ -10681,7 +10654,7 @@
     </w:lvl>
   </w:abstractNum>
   <w:abstractNum w:abstractNumId="129" w15:restartNumberingAfterBreak="0">
-    <w:nsid w:val="8445C3B1"/>
+    <w:nsid w:val="BE3E90B0"/>
     <w:multiLevelType w:val="hybridMultilevel"/>
     <w:tmpl w:val="357434FC"/>
     <w:lvl w:ilvl="0" w:tplc="A022C79E">
@@ -10771,7 +10744,7 @@
     </w:lvl>
   </w:abstractNum>
   <w:abstractNum w:abstractNumId="130" w15:restartNumberingAfterBreak="0">
-    <w:nsid w:val="49504E51"/>
+    <w:nsid w:val="49630F98"/>
     <w:multiLevelType w:val="hybridMultilevel"/>
     <w:tmpl w:val="357434FC"/>
     <w:lvl w:ilvl="0" w:tplc="A022C79E">
@@ -10861,7 +10834,7 @@
     </w:lvl>
   </w:abstractNum>
   <w:abstractNum w:abstractNumId="131" w15:restartNumberingAfterBreak="0">
-    <w:nsid w:val="B88F7E16"/>
+    <w:nsid w:val="3A52F7F6"/>
     <w:multiLevelType w:val="hybridMultilevel"/>
     <w:tmpl w:val="357434FC"/>
     <w:lvl w:ilvl="0" w:tplc="A022C79E">
@@ -10951,7 +10924,7 @@
     </w:lvl>
   </w:abstractNum>
   <w:abstractNum w:abstractNumId="132" w15:restartNumberingAfterBreak="0">
-    <w:nsid w:val="E591F0C8"/>
+    <w:nsid w:val="7BF922DB"/>
     <w:multiLevelType w:val="hybridMultilevel"/>
     <w:tmpl w:val="357434FC"/>
     <w:lvl w:ilvl="0" w:tplc="A022C79E">
@@ -11041,7 +11014,7 @@
     </w:lvl>
   </w:abstractNum>
   <w:abstractNum w:abstractNumId="133" w15:restartNumberingAfterBreak="0">
-    <w:nsid w:val="88C623C5"/>
+    <w:nsid w:val="D03D789D"/>
     <w:multiLevelType w:val="hybridMultilevel"/>
     <w:tmpl w:val="357434FC"/>
     <w:lvl w:ilvl="0" w:tplc="A022C79E">
@@ -11131,7 +11104,7 @@
     </w:lvl>
   </w:abstractNum>
   <w:abstractNum w:abstractNumId="134" w15:restartNumberingAfterBreak="0">
-    <w:nsid w:val="FA46A64E"/>
+    <w:nsid w:val="1CAE56D6"/>
     <w:multiLevelType w:val="hybridMultilevel"/>
     <w:tmpl w:val="357434FC"/>
     <w:lvl w:ilvl="0" w:tplc="A022C79E">

</xml_diff>